<commit_message>
colocar fecha si no hay fallas}
</commit_message>
<xml_diff>
--- a/app/templates/template_3.docx
+++ b/app/templates/template_3.docx
@@ -139,20 +139,22 @@
         </w:rPr>
         <w:t xml:space="preserve"> apto para su </w:t>
       </w:r>
-      <w:r>
-        <w:rPr>
-          <w:b/>
-          <w:sz w:val="22"/>
-          <w:szCs w:val="22"/>
-        </w:rPr>
-        <w:t>CERTIFICACION</w:t>
-      </w:r>
-      <w:r>
-        <w:rPr>
-          <w:sz w:val="22"/>
-          <w:szCs w:val="22"/>
-        </w:rPr>
-        <w:t>.</w:t>
+      <w:bookmarkStart w:id="1" w:name="__DdeLink__39_595940315"/>
+      <w:r>
+        <w:rPr>
+          <w:b/>
+          <w:sz w:val="22"/>
+          <w:szCs w:val="22"/>
+        </w:rPr>
+        <w:t>{{CERTIFICACION}}</w:t>
+      </w:r>
+      <w:bookmarkEnd w:id="1"/>
+      <w:r>
+        <w:rPr>
+          <w:sz w:val="22"/>
+          <w:szCs w:val="22"/>
+        </w:rPr>
+        <w:t xml:space="preserve"> {{no_grave_no_leve}}</w:t>
       </w:r>
     </w:p>
     <w:p>
@@ -346,7 +348,12 @@
               </w:rPr>
             </w:pPr>
             <w:r>
-              <w:rPr/>
+              <w:rPr>
+                <w:rFonts w:cs="Arial"/>
+                <w:sz w:val="22"/>
+                <w:szCs w:val="22"/>
+                <w:lang w:val="it-IT"/>
+              </w:rPr>
             </w:r>
           </w:p>
           <w:p>
@@ -487,7 +494,12 @@
               </w:rPr>
             </w:pPr>
             <w:r>
-              <w:rPr/>
+              <w:rPr>
+                <w:rFonts w:cs="Arial"/>
+                <w:sz w:val="22"/>
+                <w:szCs w:val="22"/>
+                <w:lang w:val="it-IT"/>
+              </w:rPr>
             </w:r>
           </w:p>
           <w:p>
@@ -632,7 +644,12 @@
               </w:rPr>
             </w:pPr>
             <w:r>
-              <w:rPr/>
+              <w:rPr>
+                <w:rFonts w:cs="Arial"/>
+                <w:sz w:val="22"/>
+                <w:szCs w:val="22"/>
+                <w:lang w:val="it-IT"/>
+              </w:rPr>
             </w:r>
           </w:p>
           <w:p>

</xml_diff>